<commit_message>
fix(solo): fit rubric docx on one page, criteria to 16pt, NSW Foundation Font
The title heading added in the previous commit was a new paragraph inserted
before the floating success-criteria table, pushing the table's first row
past the remaining page-1 space and bumping the whole table to page 2.
Now the title reuses the existing (already page-budgeted) paragraph instead
of adding a new one, with explicit zero before/after spacing.

Also bumps every success-criteria bullet to 16pt and switches every text run
in the document to NSW Foundation Font.

Co-Authored-By: Claude Sonnet 5 <noreply@anthropic.com>
</commit_message>
<xml_diff>
--- a/units/u21/Unit 21 Place Value, Decimals & Powers of 10 Student Rubric.docx
+++ b/units/u21/Unit 21 Place Value, Decimals & Powers of 10 Student Rubric.docx
@@ -2,28 +2,19 @@
 <file path=word/document.xml><?xml version="1.0" encoding="utf-8"?>
 <w:document xmlns:ns1="http://schemas.microsoft.com/office/word/2010/wordml" xmlns:w="http://schemas.openxmlformats.org/wordprocessingml/2006/main">
   <w:body>
-    <w:p>
-      <w:pPr>
+    <w:p ns1:paraId="00000001">
+      <w:pPr>
+        <w:spacing w:before="0" w:after="0" w:line="240" w:lineRule="auto"/>
         <w:jc w:val="center"/>
       </w:pPr>
       <w:r>
         <w:rPr>
-          <w:rFonts w:ascii="Comic Sans MS" w:hAnsi="Comic Sans MS" w:cs="Comic Sans MS" w:eastAsia="Comic Sans MS"/>
+          <w:rFonts w:ascii="NSW Foundation Font" w:hAnsi="NSW Foundation Font" w:cs="NSW Foundation Font" w:eastAsia="NSW Foundation Font"/>
           <w:b/>
-          <w:sz w:val="36"/>
-          <w:szCs w:val="36"/>
+          <w:sz w:val="40"/>
+          <w:szCs w:val="40"/>
         </w:rPr>
         <w:t xml:space="preserve">Unit 21 — Place Value, Decimals &amp; Powers of 10</w:t>
-      </w:r>
-    </w:p>
-    <w:p ns1:paraId="00000001">
-      <w:pPr>
-        <w:rPr/>
-      </w:pPr>
-      <w:r>
-        <w:rPr>
-          <w:rtl w:val="0"/>
-        </w:rPr>
       </w:r>
     </w:p>
     <w:tbl>
@@ -73,12 +64,12 @@
               <w:spacing w:line="240" w:lineRule="auto"/>
               <w:jc w:val="center"/>
               <w:rPr>
-                <w:rFonts w:ascii="Comic Sans MS" w:cs="Comic Sans MS" w:eastAsia="Comic Sans MS" w:hAnsi="Comic Sans MS"/>
-              </w:rPr>
-            </w:pPr>
-            <w:r>
-              <w:rPr>
-                <w:rFonts w:ascii="Comic Sans MS" w:cs="Comic Sans MS" w:eastAsia="Comic Sans MS" w:hAnsi="Comic Sans MS"/>
+                <w:rFonts w:ascii="NSW Foundation Font" w:cs="NSW Foundation Font" w:eastAsia="NSW Foundation Font" w:hAnsi="NSW Foundation Font"/>
+              </w:rPr>
+            </w:pPr>
+            <w:r>
+              <w:rPr>
+                <w:rFonts w:ascii="NSW Foundation Font" w:cs="NSW Foundation Font" w:eastAsia="NSW Foundation Font" w:hAnsi="NSW Foundation Font"/>
                 <w:b w:val="1"/>
                 <w:bCs w:val="1"/>
                 <w:rtl w:val="0"/>
@@ -109,14 +100,14 @@
               <w:spacing w:line="240" w:lineRule="auto"/>
               <w:jc w:val="center"/>
               <w:rPr>
-                <w:rFonts w:ascii="Comic Sans MS" w:cs="Comic Sans MS" w:eastAsia="Comic Sans MS" w:hAnsi="Comic Sans MS"/>
+                <w:rFonts w:ascii="NSW Foundation Font" w:cs="NSW Foundation Font" w:eastAsia="NSW Foundation Font" w:hAnsi="NSW Foundation Font"/>
                 <w:sz w:val="24"/>
                 <w:szCs w:val="24"/>
               </w:rPr>
             </w:pPr>
             <w:r>
               <w:rPr>
-                <w:rFonts w:ascii="Comic Sans MS" w:cs="Comic Sans MS" w:eastAsia="Comic Sans MS" w:hAnsi="Comic Sans MS"/>
+                <w:rFonts w:ascii="NSW Foundation Font" w:cs="NSW Foundation Font" w:eastAsia="NSW Foundation Font" w:hAnsi="NSW Foundation Font"/>
                 <w:color w:val="22272b"/>
                 <w:sz w:val="26"/>
                 <w:szCs w:val="26"/>
@@ -149,14 +140,14 @@
               <w:spacing w:line="240" w:lineRule="auto"/>
               <w:jc w:val="center"/>
               <w:rPr>
-                <w:rFonts w:ascii="Comic Sans MS" w:cs="Comic Sans MS" w:eastAsia="Comic Sans MS" w:hAnsi="Comic Sans MS"/>
+                <w:rFonts w:ascii="NSW Foundation Font" w:cs="NSW Foundation Font" w:eastAsia="NSW Foundation Font" w:hAnsi="NSW Foundation Font"/>
                 <w:b w:val="1"/>
                 <w:bCs w:val="1"/>
               </w:rPr>
             </w:pPr>
             <w:r>
               <w:rPr>
-                <w:rFonts w:ascii="Comic Sans MS" w:cs="Comic Sans MS" w:eastAsia="Comic Sans MS" w:hAnsi="Comic Sans MS"/>
+                <w:rFonts w:ascii="NSW Foundation Font" w:cs="NSW Foundation Font" w:eastAsia="NSW Foundation Font" w:hAnsi="NSW Foundation Font"/>
                 <w:b w:val="1"/>
                 <w:bCs w:val="1"/>
                 <w:rtl w:val="0"/>
@@ -182,12 +173,12 @@
               <w:spacing w:line="240" w:lineRule="auto"/>
               <w:jc w:val="center"/>
               <w:rPr>
-                <w:rFonts w:ascii="Comic Sans MS" w:cs="Comic Sans MS" w:eastAsia="Comic Sans MS" w:hAnsi="Comic Sans MS"/>
-              </w:rPr>
-            </w:pPr>
-            <w:r>
-              <w:rPr>
-                <w:rFonts w:ascii="Comic Sans MS" w:cs="Comic Sans MS" w:eastAsia="Comic Sans MS" w:hAnsi="Comic Sans MS"/>
+                <w:rFonts w:ascii="NSW Foundation Font" w:cs="NSW Foundation Font" w:eastAsia="NSW Foundation Font" w:hAnsi="NSW Foundation Font"/>
+              </w:rPr>
+            </w:pPr>
+            <w:r>
+              <w:rPr>
+                <w:rFonts w:ascii="NSW Foundation Font" w:cs="NSW Foundation Font" w:eastAsia="NSW Foundation Font" w:hAnsi="NSW Foundation Font"/>
                 <w:rtl w:val="0"/>
               </w:rPr>
               <w:t xml:space="preserve">Red</w:t>
@@ -204,12 +195,12 @@
               <w:spacing w:line="240" w:lineRule="auto"/>
               <w:jc w:val="center"/>
               <w:rPr>
-                <w:rFonts w:ascii="Comic Sans MS" w:cs="Comic Sans MS" w:eastAsia="Comic Sans MS" w:hAnsi="Comic Sans MS"/>
-              </w:rPr>
-            </w:pPr>
-            <w:r>
-              <w:rPr>
-                <w:rFonts w:ascii="Comic Sans MS" w:cs="Comic Sans MS" w:eastAsia="Comic Sans MS" w:hAnsi="Comic Sans MS"/>
+                <w:rFonts w:ascii="NSW Foundation Font" w:cs="NSW Foundation Font" w:eastAsia="NSW Foundation Font" w:hAnsi="NSW Foundation Font"/>
+              </w:rPr>
+            </w:pPr>
+            <w:r>
+              <w:rPr>
+                <w:rFonts w:ascii="NSW Foundation Font" w:cs="NSW Foundation Font" w:eastAsia="NSW Foundation Font" w:hAnsi="NSW Foundation Font"/>
                 <w:rtl w:val="0"/>
               </w:rPr>
               <w:t xml:space="preserve">Yellow</w:t>
@@ -226,12 +217,12 @@
               <w:spacing w:line="240" w:lineRule="auto"/>
               <w:jc w:val="center"/>
               <w:rPr>
-                <w:rFonts w:ascii="Comic Sans MS" w:cs="Comic Sans MS" w:eastAsia="Comic Sans MS" w:hAnsi="Comic Sans MS"/>
-              </w:rPr>
-            </w:pPr>
-            <w:r>
-              <w:rPr>
-                <w:rFonts w:ascii="Comic Sans MS" w:cs="Comic Sans MS" w:eastAsia="Comic Sans MS" w:hAnsi="Comic Sans MS"/>
+                <w:rFonts w:ascii="NSW Foundation Font" w:cs="NSW Foundation Font" w:eastAsia="NSW Foundation Font" w:hAnsi="NSW Foundation Font"/>
+              </w:rPr>
+            </w:pPr>
+            <w:r>
+              <w:rPr>
+                <w:rFonts w:ascii="NSW Foundation Font" w:cs="NSW Foundation Font" w:eastAsia="NSW Foundation Font" w:hAnsi="NSW Foundation Font"/>
                 <w:rtl w:val="0"/>
               </w:rPr>
               <w:t xml:space="preserve">Green</w:t>
@@ -266,9 +257,9 @@
             </w:pPr>
             <w:r>
               <w:rPr>
-                <w:rFonts w:ascii="Roboto" w:cs="Roboto" w:eastAsia="Roboto" w:hAnsi="Roboto"/>
-                <w:sz w:val="24"/>
-                <w:szCs w:val="24"/>
+                <w:rFonts w:ascii="NSW Foundation Font" w:cs="NSW Foundation Font" w:eastAsia="NSW Foundation Font" w:hAnsi="NSW Foundation Font"/>
+                <w:sz w:val="32"/>
+                <w:szCs w:val="32"/>
                 <w:rtl w:val="0"/>
               </w:rPr>
               <w:t xml:space="preserve">read and order numbers in the millions (to 1 billion)</w:t>
@@ -286,7 +277,7 @@
               <w:shd w:fill="ffffff" w:val="clear"/>
               <w:spacing w:line="240" w:lineRule="auto"/>
               <w:rPr>
-                <w:rFonts w:ascii="Roboto" w:cs="Roboto" w:eastAsia="Roboto" w:hAnsi="Roboto"/>
+                <w:rFonts w:ascii="NSW Foundation Font" w:cs="NSW Foundation Font" w:eastAsia="NSW Foundation Font" w:hAnsi="NSW Foundation Font"/>
                 <w:sz w:val="24"/>
                 <w:szCs w:val="24"/>
               </w:rPr>
@@ -316,9 +307,9 @@
             </w:pPr>
             <w:r>
               <w:rPr>
-                <w:rFonts w:ascii="Roboto" w:cs="Roboto" w:eastAsia="Roboto" w:hAnsi="Roboto"/>
-                <w:sz w:val="24"/>
-                <w:szCs w:val="24"/>
+                <w:rFonts w:ascii="NSW Foundation Font" w:cs="NSW Foundation Font" w:eastAsia="NSW Foundation Font" w:hAnsi="NSW Foundation Font"/>
+                <w:sz w:val="32"/>
+                <w:szCs w:val="32"/>
                 <w:rtl w:val="0"/>
               </w:rPr>
               <w:t xml:space="preserve">compare and order decimals to 3 decimal places</w:t>
@@ -336,7 +327,7 @@
               <w:shd w:fill="ffffff" w:val="clear"/>
               <w:spacing w:line="240" w:lineRule="auto"/>
               <w:rPr>
-                <w:rFonts w:ascii="Roboto" w:cs="Roboto" w:eastAsia="Roboto" w:hAnsi="Roboto"/>
+                <w:rFonts w:ascii="NSW Foundation Font" w:cs="NSW Foundation Font" w:eastAsia="NSW Foundation Font" w:hAnsi="NSW Foundation Font"/>
                 <w:sz w:val="24"/>
                 <w:szCs w:val="24"/>
               </w:rPr>
@@ -366,9 +357,9 @@
             </w:pPr>
             <w:r>
               <w:rPr>
-                <w:rFonts w:ascii="Roboto" w:cs="Roboto" w:eastAsia="Roboto" w:hAnsi="Roboto"/>
-                <w:sz w:val="24"/>
-                <w:szCs w:val="24"/>
+                <w:rFonts w:ascii="NSW Foundation Font" w:cs="NSW Foundation Font" w:eastAsia="NSW Foundation Font" w:hAnsi="NSW Foundation Font"/>
+                <w:sz w:val="32"/>
+                <w:szCs w:val="32"/>
                 <w:rtl w:val="0"/>
               </w:rPr>
               <w:t xml:space="preserve">multiply one-digit numbers by 10, 100 and 1000 mentally</w:t>
@@ -396,9 +387,9 @@
             </w:pPr>
             <w:r>
               <w:rPr>
-                <w:rFonts w:ascii="Roboto" w:cs="Roboto" w:eastAsia="Roboto" w:hAnsi="Roboto"/>
-                <w:sz w:val="24"/>
-                <w:szCs w:val="24"/>
+                <w:rFonts w:ascii="NSW Foundation Font" w:cs="NSW Foundation Font" w:eastAsia="NSW Foundation Font" w:hAnsi="NSW Foundation Font"/>
+                <w:sz w:val="32"/>
+                <w:szCs w:val="32"/>
                 <w:rtl w:val="0"/>
               </w:rPr>
               <w:t xml:space="preserve">partition and regroup numbers in non-standard forms</w:t>
@@ -416,7 +407,7 @@
               <w:shd w:fill="ffffff" w:val="clear"/>
               <w:spacing w:line="240" w:lineRule="auto"/>
               <w:rPr>
-                <w:rFonts w:ascii="Roboto" w:cs="Roboto" w:eastAsia="Roboto" w:hAnsi="Roboto"/>
+                <w:rFonts w:ascii="NSW Foundation Font" w:cs="NSW Foundation Font" w:eastAsia="NSW Foundation Font" w:hAnsi="NSW Foundation Font"/>
                 <w:sz w:val="24"/>
                 <w:szCs w:val="24"/>
               </w:rPr>
@@ -446,9 +437,9 @@
             </w:pPr>
             <w:r>
               <w:rPr>
-                <w:rFonts w:ascii="Roboto" w:cs="Roboto" w:eastAsia="Roboto" w:hAnsi="Roboto"/>
-                <w:sz w:val="24"/>
-                <w:szCs w:val="24"/>
+                <w:rFonts w:ascii="NSW Foundation Font" w:cs="NSW Foundation Font" w:eastAsia="NSW Foundation Font" w:hAnsi="NSW Foundation Font"/>
+                <w:sz w:val="32"/>
+                <w:szCs w:val="32"/>
                 <w:rtl w:val="0"/>
               </w:rPr>
               <w:t xml:space="preserve">find 10/100 times (and one-tenth/one-hundredth of) a decimal</w:t>
@@ -466,7 +457,7 @@
               <w:shd w:fill="ffffff" w:val="clear"/>
               <w:spacing w:line="240" w:lineRule="auto"/>
               <w:rPr>
-                <w:rFonts w:ascii="Roboto" w:cs="Roboto" w:eastAsia="Roboto" w:hAnsi="Roboto"/>
+                <w:rFonts w:ascii="NSW Foundation Font" w:cs="NSW Foundation Font" w:eastAsia="NSW Foundation Font" w:hAnsi="NSW Foundation Font"/>
                 <w:sz w:val="24"/>
                 <w:szCs w:val="24"/>
               </w:rPr>
@@ -496,9 +487,9 @@
             </w:pPr>
             <w:r>
               <w:rPr>
-                <w:rFonts w:ascii="Roboto" w:cs="Roboto" w:eastAsia="Roboto" w:hAnsi="Roboto"/>
-                <w:sz w:val="24"/>
-                <w:szCs w:val="24"/>
+                <w:rFonts w:ascii="NSW Foundation Font" w:cs="NSW Foundation Font" w:eastAsia="NSW Foundation Font" w:hAnsi="NSW Foundation Font"/>
+                <w:sz w:val="32"/>
+                <w:szCs w:val="32"/>
                 <w:rtl w:val="0"/>
               </w:rPr>
               <w:t xml:space="preserve">add and subtract decimals to 3 decimal places</w:t>
@@ -516,7 +507,7 @@
               <w:shd w:fill="ffffff" w:val="clear"/>
               <w:spacing w:line="240" w:lineRule="auto"/>
               <w:rPr>
-                <w:rFonts w:ascii="Roboto" w:cs="Roboto" w:eastAsia="Roboto" w:hAnsi="Roboto"/>
+                <w:rFonts w:ascii="NSW Foundation Font" w:cs="NSW Foundation Font" w:eastAsia="NSW Foundation Font" w:hAnsi="NSW Foundation Font"/>
                 <w:sz w:val="24"/>
                 <w:szCs w:val="24"/>
               </w:rPr>
@@ -546,9 +537,9 @@
             </w:pPr>
             <w:r>
               <w:rPr>
-                <w:rFonts w:ascii="Roboto" w:cs="Roboto" w:eastAsia="Roboto" w:hAnsi="Roboto"/>
-                <w:sz w:val="24"/>
-                <w:szCs w:val="24"/>
+                <w:rFonts w:ascii="NSW Foundation Font" w:cs="NSW Foundation Font" w:eastAsia="NSW Foundation Font" w:hAnsi="NSW Foundation Font"/>
+                <w:sz w:val="32"/>
+                <w:szCs w:val="32"/>
                 <w:rtl w:val="0"/>
               </w:rPr>
               <w:t xml:space="preserve">estimate products and check the reasonableness of answers</w:t>
@@ -576,9 +567,9 @@
             </w:pPr>
             <w:r>
               <w:rPr>
-                <w:rFonts w:ascii="Roboto" w:cs="Roboto" w:eastAsia="Roboto" w:hAnsi="Roboto"/>
-                <w:sz w:val="24"/>
-                <w:szCs w:val="24"/>
+                <w:rFonts w:ascii="NSW Foundation Font" w:cs="NSW Foundation Font" w:eastAsia="NSW Foundation Font" w:hAnsi="NSW Foundation Font"/>
+                <w:sz w:val="32"/>
+                <w:szCs w:val="32"/>
                 <w:rtl w:val="0"/>
               </w:rPr>
               <w:t xml:space="preserve">powers of 10 and index notation</w:t>
@@ -596,7 +587,7 @@
               <w:shd w:fill="ffffff" w:val="clear"/>
               <w:spacing w:line="240" w:lineRule="auto"/>
               <w:rPr>
-                <w:rFonts w:ascii="Roboto" w:cs="Roboto" w:eastAsia="Roboto" w:hAnsi="Roboto"/>
+                <w:rFonts w:ascii="NSW Foundation Font" w:cs="NSW Foundation Font" w:eastAsia="NSW Foundation Font" w:hAnsi="NSW Foundation Font"/>
                 <w:sz w:val="24"/>
                 <w:szCs w:val="24"/>
               </w:rPr>
@@ -626,9 +617,9 @@
             </w:pPr>
             <w:r>
               <w:rPr>
-                <w:rFonts w:ascii="Roboto" w:cs="Roboto" w:eastAsia="Roboto" w:hAnsi="Roboto"/>
-                <w:sz w:val="24"/>
-                <w:szCs w:val="24"/>
+                <w:rFonts w:ascii="NSW Foundation Font" w:cs="NSW Foundation Font" w:eastAsia="NSW Foundation Font" w:hAnsi="NSW Foundation Font"/>
+                <w:sz w:val="32"/>
+                <w:szCs w:val="32"/>
                 <w:rtl w:val="0"/>
               </w:rPr>
               <w:t xml:space="preserve">multiply and divide decimals (including by powers of 10)</w:t>
@@ -646,7 +637,7 @@
               <w:shd w:fill="ffffff" w:val="clear"/>
               <w:spacing w:line="240" w:lineRule="auto"/>
               <w:rPr>
-                <w:rFonts w:ascii="Roboto" w:cs="Roboto" w:eastAsia="Roboto" w:hAnsi="Roboto"/>
+                <w:rFonts w:ascii="NSW Foundation Font" w:cs="NSW Foundation Font" w:eastAsia="NSW Foundation Font" w:hAnsi="NSW Foundation Font"/>
                 <w:sz w:val="24"/>
                 <w:szCs w:val="24"/>
               </w:rPr>
@@ -676,9 +667,9 @@
             </w:pPr>
             <w:r>
               <w:rPr>
-                <w:rFonts w:ascii="Roboto" w:cs="Roboto" w:eastAsia="Roboto" w:hAnsi="Roboto"/>
-                <w:sz w:val="24"/>
-                <w:szCs w:val="24"/>
+                <w:rFonts w:ascii="NSW Foundation Font" w:cs="NSW Foundation Font" w:eastAsia="NSW Foundation Font" w:hAnsi="NSW Foundation Font"/>
+                <w:sz w:val="32"/>
+                <w:szCs w:val="32"/>
                 <w:rtl w:val="0"/>
               </w:rPr>
               <w:t xml:space="preserve">order of operations with whole numbers and decimals</w:t>

</xml_diff>

<commit_message>
fix(solo): remove fixed 5.7in row floor forcing rubric docx to page 2
Row 4 (the success-criteria row) had a hardcoded atLeast height of 8203
twips (~5.7in) regardless of actual content, on an ~8.3in usable landscape
page. That left almost no margin for anything above it, so the title added
in the previous commit was still enough to push the whole table to page 2.

Row height is now content-driven (no floor) — the tallest real column
(u26's 9 red criteria) only needs ~2.8in, freeing several inches of slack.
Also replaced the full blank spacer paragraph between bullets with a small
spacing-after value, and zeroed the top/bottom page margins for further
headroom.

Co-Authored-By: Claude Sonnet 5 <noreply@anthropic.com>
</commit_message>
<xml_diff>
--- a/units/u21/Unit 21 Place Value, Decimals & Powers of 10 Student Rubric.docx
+++ b/units/u21/Unit 21 Place Value, Decimals & Powers of 10 Student Rubric.docx
@@ -11,8 +11,8 @@
         <w:rPr>
           <w:rFonts w:ascii="NSW Foundation Font" w:hAnsi="NSW Foundation Font" w:cs="NSW Foundation Font" w:eastAsia="NSW Foundation Font"/>
           <w:b/>
-          <w:sz w:val="40"/>
-          <w:szCs w:val="40"/>
+          <w:sz w:val="36"/>
+          <w:szCs w:val="36"/>
         </w:rPr>
         <w:t xml:space="preserve">Unit 21 — Place Value, Decimals &amp; Powers of 10</w:t>
       </w:r>
@@ -233,7 +233,6 @@
       <w:tr>
         <w:trPr>
           <w:cantSplit w:val="0"/>
-          <w:trHeight w:val="8203.359375" w:hRule="atLeast"/>
           <w:tblHeader w:val="0"/>
         </w:trPr>
         <w:tc>
@@ -252,7 +251,7 @@
                 <w:between w:color="e5e7eb" w:space="0" w:sz="0" w:val="none"/>
               </w:pBdr>
               <w:shd w:fill="ffffff" w:val="clear"/>
-              <w:spacing w:line="240" w:lineRule="auto"/>
+              <w:spacing w:line="240" w:lineRule="auto" w:after="80"/>
               <w:ind w:left="720" w:hanging="360"/>
             </w:pPr>
             <w:r>
@@ -263,29 +262,6 @@
                 <w:rtl w:val="0"/>
               </w:rPr>
               <w:t xml:space="preserve">read and order numbers in the millions (to 1 billion)</w:t>
-            </w:r>
-          </w:p>
-          <w:p ns1:paraId="0000000F">
-            <w:pPr>
-              <w:pBdr>
-                <w:top w:color="e5e7eb" w:space="0" w:sz="0" w:val="none"/>
-                <w:left w:color="e5e7eb" w:space="0" w:sz="0" w:val="none"/>
-                <w:bottom w:color="e5e7eb" w:space="0" w:sz="0" w:val="none"/>
-                <w:right w:color="e5e7eb" w:space="0" w:sz="0" w:val="none"/>
-                <w:between w:color="e5e7eb" w:space="0" w:sz="0" w:val="none"/>
-              </w:pBdr>
-              <w:shd w:fill="ffffff" w:val="clear"/>
-              <w:spacing w:line="240" w:lineRule="auto"/>
-              <w:rPr>
-                <w:rFonts w:ascii="NSW Foundation Font" w:cs="NSW Foundation Font" w:eastAsia="NSW Foundation Font" w:hAnsi="NSW Foundation Font"/>
-                <w:sz w:val="24"/>
-                <w:szCs w:val="24"/>
-              </w:rPr>
-            </w:pPr>
-            <w:r>
-              <w:rPr>
-                <w:rtl w:val="0"/>
-              </w:rPr>
             </w:r>
           </w:p>
           <w:p ns1:paraId="0000000E">
@@ -302,7 +278,7 @@
                 <w:between w:color="e5e7eb" w:space="0" w:sz="0" w:val="none"/>
               </w:pBdr>
               <w:shd w:fill="ffffff" w:val="clear"/>
-              <w:spacing w:line="240" w:lineRule="auto"/>
+              <w:spacing w:line="240" w:lineRule="auto" w:after="80"/>
               <w:ind w:left="720" w:hanging="360"/>
             </w:pPr>
             <w:r>
@@ -313,29 +289,6 @@
                 <w:rtl w:val="0"/>
               </w:rPr>
               <w:t xml:space="preserve">compare and order decimals to 3 decimal places</w:t>
-            </w:r>
-          </w:p>
-          <w:p ns1:paraId="0000000F">
-            <w:pPr>
-              <w:pBdr>
-                <w:top w:color="e5e7eb" w:space="0" w:sz="0" w:val="none"/>
-                <w:left w:color="e5e7eb" w:space="0" w:sz="0" w:val="none"/>
-                <w:bottom w:color="e5e7eb" w:space="0" w:sz="0" w:val="none"/>
-                <w:right w:color="e5e7eb" w:space="0" w:sz="0" w:val="none"/>
-                <w:between w:color="e5e7eb" w:space="0" w:sz="0" w:val="none"/>
-              </w:pBdr>
-              <w:shd w:fill="ffffff" w:val="clear"/>
-              <w:spacing w:line="240" w:lineRule="auto"/>
-              <w:rPr>
-                <w:rFonts w:ascii="NSW Foundation Font" w:cs="NSW Foundation Font" w:eastAsia="NSW Foundation Font" w:hAnsi="NSW Foundation Font"/>
-                <w:sz w:val="24"/>
-                <w:szCs w:val="24"/>
-              </w:rPr>
-            </w:pPr>
-            <w:r>
-              <w:rPr>
-                <w:rtl w:val="0"/>
-              </w:rPr>
             </w:r>
           </w:p>
           <w:p ns1:paraId="0000000E">
@@ -352,7 +305,7 @@
                 <w:between w:color="e5e7eb" w:space="0" w:sz="0" w:val="none"/>
               </w:pBdr>
               <w:shd w:fill="ffffff" w:val="clear"/>
-              <w:spacing w:line="240" w:lineRule="auto"/>
+              <w:spacing w:line="240" w:lineRule="auto" w:after="80"/>
               <w:ind w:left="720" w:hanging="360"/>
             </w:pPr>
             <w:r>
@@ -382,7 +335,7 @@
                 <w:between w:color="e5e7eb" w:space="0" w:sz="0" w:val="none"/>
               </w:pBdr>
               <w:shd w:fill="ffffff" w:val="clear"/>
-              <w:spacing w:line="240" w:lineRule="auto"/>
+              <w:spacing w:line="240" w:lineRule="auto" w:after="80"/>
               <w:ind w:left="720" w:hanging="360"/>
             </w:pPr>
             <w:r>
@@ -393,29 +346,6 @@
                 <w:rtl w:val="0"/>
               </w:rPr>
               <w:t xml:space="preserve">partition and regroup numbers in non-standard forms</w:t>
-            </w:r>
-          </w:p>
-          <w:p ns1:paraId="0000000F">
-            <w:pPr>
-              <w:pBdr>
-                <w:top w:color="e5e7eb" w:space="0" w:sz="0" w:val="none"/>
-                <w:left w:color="e5e7eb" w:space="0" w:sz="0" w:val="none"/>
-                <w:bottom w:color="e5e7eb" w:space="0" w:sz="0" w:val="none"/>
-                <w:right w:color="e5e7eb" w:space="0" w:sz="0" w:val="none"/>
-                <w:between w:color="e5e7eb" w:space="0" w:sz="0" w:val="none"/>
-              </w:pBdr>
-              <w:shd w:fill="ffffff" w:val="clear"/>
-              <w:spacing w:line="240" w:lineRule="auto"/>
-              <w:rPr>
-                <w:rFonts w:ascii="NSW Foundation Font" w:cs="NSW Foundation Font" w:eastAsia="NSW Foundation Font" w:hAnsi="NSW Foundation Font"/>
-                <w:sz w:val="24"/>
-                <w:szCs w:val="24"/>
-              </w:rPr>
-            </w:pPr>
-            <w:r>
-              <w:rPr>
-                <w:rtl w:val="0"/>
-              </w:rPr>
             </w:r>
           </w:p>
           <w:p ns1:paraId="0000000E">
@@ -432,7 +362,7 @@
                 <w:between w:color="e5e7eb" w:space="0" w:sz="0" w:val="none"/>
               </w:pBdr>
               <w:shd w:fill="ffffff" w:val="clear"/>
-              <w:spacing w:line="240" w:lineRule="auto"/>
+              <w:spacing w:line="240" w:lineRule="auto" w:after="80"/>
               <w:ind w:left="720" w:hanging="360"/>
             </w:pPr>
             <w:r>
@@ -443,29 +373,6 @@
                 <w:rtl w:val="0"/>
               </w:rPr>
               <w:t xml:space="preserve">find 10/100 times (and one-tenth/one-hundredth of) a decimal</w:t>
-            </w:r>
-          </w:p>
-          <w:p ns1:paraId="0000000F">
-            <w:pPr>
-              <w:pBdr>
-                <w:top w:color="e5e7eb" w:space="0" w:sz="0" w:val="none"/>
-                <w:left w:color="e5e7eb" w:space="0" w:sz="0" w:val="none"/>
-                <w:bottom w:color="e5e7eb" w:space="0" w:sz="0" w:val="none"/>
-                <w:right w:color="e5e7eb" w:space="0" w:sz="0" w:val="none"/>
-                <w:between w:color="e5e7eb" w:space="0" w:sz="0" w:val="none"/>
-              </w:pBdr>
-              <w:shd w:fill="ffffff" w:val="clear"/>
-              <w:spacing w:line="240" w:lineRule="auto"/>
-              <w:rPr>
-                <w:rFonts w:ascii="NSW Foundation Font" w:cs="NSW Foundation Font" w:eastAsia="NSW Foundation Font" w:hAnsi="NSW Foundation Font"/>
-                <w:sz w:val="24"/>
-                <w:szCs w:val="24"/>
-              </w:rPr>
-            </w:pPr>
-            <w:r>
-              <w:rPr>
-                <w:rtl w:val="0"/>
-              </w:rPr>
             </w:r>
           </w:p>
           <w:p ns1:paraId="0000000E">
@@ -482,7 +389,7 @@
                 <w:between w:color="e5e7eb" w:space="0" w:sz="0" w:val="none"/>
               </w:pBdr>
               <w:shd w:fill="ffffff" w:val="clear"/>
-              <w:spacing w:line="240" w:lineRule="auto"/>
+              <w:spacing w:line="240" w:lineRule="auto" w:after="80"/>
               <w:ind w:left="720" w:hanging="360"/>
             </w:pPr>
             <w:r>
@@ -493,29 +400,6 @@
                 <w:rtl w:val="0"/>
               </w:rPr>
               <w:t xml:space="preserve">add and subtract decimals to 3 decimal places</w:t>
-            </w:r>
-          </w:p>
-          <w:p ns1:paraId="0000000F">
-            <w:pPr>
-              <w:pBdr>
-                <w:top w:color="e5e7eb" w:space="0" w:sz="0" w:val="none"/>
-                <w:left w:color="e5e7eb" w:space="0" w:sz="0" w:val="none"/>
-                <w:bottom w:color="e5e7eb" w:space="0" w:sz="0" w:val="none"/>
-                <w:right w:color="e5e7eb" w:space="0" w:sz="0" w:val="none"/>
-                <w:between w:color="e5e7eb" w:space="0" w:sz="0" w:val="none"/>
-              </w:pBdr>
-              <w:shd w:fill="ffffff" w:val="clear"/>
-              <w:spacing w:line="240" w:lineRule="auto"/>
-              <w:rPr>
-                <w:rFonts w:ascii="NSW Foundation Font" w:cs="NSW Foundation Font" w:eastAsia="NSW Foundation Font" w:hAnsi="NSW Foundation Font"/>
-                <w:sz w:val="24"/>
-                <w:szCs w:val="24"/>
-              </w:rPr>
-            </w:pPr>
-            <w:r>
-              <w:rPr>
-                <w:rtl w:val="0"/>
-              </w:rPr>
             </w:r>
           </w:p>
           <w:p ns1:paraId="0000000E">
@@ -532,7 +416,7 @@
                 <w:between w:color="e5e7eb" w:space="0" w:sz="0" w:val="none"/>
               </w:pBdr>
               <w:shd w:fill="ffffff" w:val="clear"/>
-              <w:spacing w:line="240" w:lineRule="auto"/>
+              <w:spacing w:line="240" w:lineRule="auto" w:after="80"/>
               <w:ind w:left="720" w:hanging="360"/>
             </w:pPr>
             <w:r>
@@ -562,7 +446,7 @@
                 <w:between w:color="e5e7eb" w:space="0" w:sz="0" w:val="none"/>
               </w:pBdr>
               <w:shd w:fill="ffffff" w:val="clear"/>
-              <w:spacing w:line="240" w:lineRule="auto"/>
+              <w:spacing w:line="240" w:lineRule="auto" w:after="80"/>
               <w:ind w:left="720" w:hanging="360"/>
             </w:pPr>
             <w:r>
@@ -573,29 +457,6 @@
                 <w:rtl w:val="0"/>
               </w:rPr>
               <w:t xml:space="preserve">powers of 10 and index notation</w:t>
-            </w:r>
-          </w:p>
-          <w:p ns1:paraId="0000000F">
-            <w:pPr>
-              <w:pBdr>
-                <w:top w:color="e5e7eb" w:space="0" w:sz="0" w:val="none"/>
-                <w:left w:color="e5e7eb" w:space="0" w:sz="0" w:val="none"/>
-                <w:bottom w:color="e5e7eb" w:space="0" w:sz="0" w:val="none"/>
-                <w:right w:color="e5e7eb" w:space="0" w:sz="0" w:val="none"/>
-                <w:between w:color="e5e7eb" w:space="0" w:sz="0" w:val="none"/>
-              </w:pBdr>
-              <w:shd w:fill="ffffff" w:val="clear"/>
-              <w:spacing w:line="240" w:lineRule="auto"/>
-              <w:rPr>
-                <w:rFonts w:ascii="NSW Foundation Font" w:cs="NSW Foundation Font" w:eastAsia="NSW Foundation Font" w:hAnsi="NSW Foundation Font"/>
-                <w:sz w:val="24"/>
-                <w:szCs w:val="24"/>
-              </w:rPr>
-            </w:pPr>
-            <w:r>
-              <w:rPr>
-                <w:rtl w:val="0"/>
-              </w:rPr>
             </w:r>
           </w:p>
           <w:p ns1:paraId="0000000E">
@@ -612,7 +473,7 @@
                 <w:between w:color="e5e7eb" w:space="0" w:sz="0" w:val="none"/>
               </w:pBdr>
               <w:shd w:fill="ffffff" w:val="clear"/>
-              <w:spacing w:line="240" w:lineRule="auto"/>
+              <w:spacing w:line="240" w:lineRule="auto" w:after="80"/>
               <w:ind w:left="720" w:hanging="360"/>
             </w:pPr>
             <w:r>
@@ -623,29 +484,6 @@
                 <w:rtl w:val="0"/>
               </w:rPr>
               <w:t xml:space="preserve">multiply and divide decimals (including by powers of 10)</w:t>
-            </w:r>
-          </w:p>
-          <w:p ns1:paraId="0000000F">
-            <w:pPr>
-              <w:pBdr>
-                <w:top w:color="e5e7eb" w:space="0" w:sz="0" w:val="none"/>
-                <w:left w:color="e5e7eb" w:space="0" w:sz="0" w:val="none"/>
-                <w:bottom w:color="e5e7eb" w:space="0" w:sz="0" w:val="none"/>
-                <w:right w:color="e5e7eb" w:space="0" w:sz="0" w:val="none"/>
-                <w:between w:color="e5e7eb" w:space="0" w:sz="0" w:val="none"/>
-              </w:pBdr>
-              <w:shd w:fill="ffffff" w:val="clear"/>
-              <w:spacing w:line="240" w:lineRule="auto"/>
-              <w:rPr>
-                <w:rFonts w:ascii="NSW Foundation Font" w:cs="NSW Foundation Font" w:eastAsia="NSW Foundation Font" w:hAnsi="NSW Foundation Font"/>
-                <w:sz w:val="24"/>
-                <w:szCs w:val="24"/>
-              </w:rPr>
-            </w:pPr>
-            <w:r>
-              <w:rPr>
-                <w:rtl w:val="0"/>
-              </w:rPr>
             </w:r>
           </w:p>
           <w:p ns1:paraId="0000000E">
@@ -662,7 +500,7 @@
                 <w:between w:color="e5e7eb" w:space="0" w:sz="0" w:val="none"/>
               </w:pBdr>
               <w:shd w:fill="ffffff" w:val="clear"/>
-              <w:spacing w:line="240" w:lineRule="auto"/>
+              <w:spacing w:line="240" w:lineRule="auto" w:after="80"/>
               <w:ind w:left="720" w:hanging="360"/>
             </w:pPr>
             <w:r>
@@ -680,7 +518,7 @@
     </w:tbl>
     <w:sectPr>
       <w:pgSz w:h="12240" w:w="20160" w:orient="landscape"/>
-      <w:pgMar w:bottom="144" w:top="144" w:left="1440" w:right="1440" w:header="720" w:footer="720"/>
+      <w:pgMar w:bottom="0" w:top="0" w:left="1440" w:right="1440" w:header="720" w:footer="720"/>
       <w:pgNumType w:start="1"/>
     </w:sectPr>
   </w:body>

</xml_diff>

<commit_message>
fix(solo): correct font family name to Edu NSW ACT Foundation
"NSW Foundation Font" wasn't an installed font name, so Word was silently
substituting a fallback while still showing the requested name. The correct
family is the Google Fonts release "Edu NSW ACT Foundation" (confirmed on
fonts.google.com).

Co-Authored-By: Claude Sonnet 5 <noreply@anthropic.com>
</commit_message>
<xml_diff>
--- a/units/u21/Unit 21 Place Value, Decimals & Powers of 10 Student Rubric.docx
+++ b/units/u21/Unit 21 Place Value, Decimals & Powers of 10 Student Rubric.docx
@@ -9,7 +9,7 @@
       </w:pPr>
       <w:r>
         <w:rPr>
-          <w:rFonts w:ascii="NSW Foundation Font" w:hAnsi="NSW Foundation Font" w:cs="NSW Foundation Font" w:eastAsia="NSW Foundation Font"/>
+          <w:rFonts w:ascii="Edu NSW ACT Foundation" w:hAnsi="Edu NSW ACT Foundation" w:cs="Edu NSW ACT Foundation" w:eastAsia="Edu NSW ACT Foundation"/>
           <w:b/>
           <w:sz w:val="36"/>
           <w:szCs w:val="36"/>
@@ -64,12 +64,12 @@
               <w:spacing w:line="240" w:lineRule="auto"/>
               <w:jc w:val="center"/>
               <w:rPr>
-                <w:rFonts w:ascii="NSW Foundation Font" w:cs="NSW Foundation Font" w:eastAsia="NSW Foundation Font" w:hAnsi="NSW Foundation Font"/>
+                <w:rFonts w:ascii="Edu NSW ACT Foundation" w:cs="Edu NSW ACT Foundation" w:eastAsia="Edu NSW ACT Foundation" w:hAnsi="Edu NSW ACT Foundation"/>
               </w:rPr>
             </w:pPr>
             <w:r>
               <w:rPr>
-                <w:rFonts w:ascii="NSW Foundation Font" w:cs="NSW Foundation Font" w:eastAsia="NSW Foundation Font" w:hAnsi="NSW Foundation Font"/>
+                <w:rFonts w:ascii="Edu NSW ACT Foundation" w:cs="Edu NSW ACT Foundation" w:eastAsia="Edu NSW ACT Foundation" w:hAnsi="Edu NSW ACT Foundation"/>
                 <w:b w:val="1"/>
                 <w:bCs w:val="1"/>
                 <w:rtl w:val="0"/>
@@ -100,14 +100,14 @@
               <w:spacing w:line="240" w:lineRule="auto"/>
               <w:jc w:val="center"/>
               <w:rPr>
-                <w:rFonts w:ascii="NSW Foundation Font" w:cs="NSW Foundation Font" w:eastAsia="NSW Foundation Font" w:hAnsi="NSW Foundation Font"/>
+                <w:rFonts w:ascii="Edu NSW ACT Foundation" w:cs="Edu NSW ACT Foundation" w:eastAsia="Edu NSW ACT Foundation" w:hAnsi="Edu NSW ACT Foundation"/>
                 <w:sz w:val="24"/>
                 <w:szCs w:val="24"/>
               </w:rPr>
             </w:pPr>
             <w:r>
               <w:rPr>
-                <w:rFonts w:ascii="NSW Foundation Font" w:cs="NSW Foundation Font" w:eastAsia="NSW Foundation Font" w:hAnsi="NSW Foundation Font"/>
+                <w:rFonts w:ascii="Edu NSW ACT Foundation" w:cs="Edu NSW ACT Foundation" w:eastAsia="Edu NSW ACT Foundation" w:hAnsi="Edu NSW ACT Foundation"/>
                 <w:color w:val="22272b"/>
                 <w:sz w:val="26"/>
                 <w:szCs w:val="26"/>
@@ -140,14 +140,14 @@
               <w:spacing w:line="240" w:lineRule="auto"/>
               <w:jc w:val="center"/>
               <w:rPr>
-                <w:rFonts w:ascii="NSW Foundation Font" w:cs="NSW Foundation Font" w:eastAsia="NSW Foundation Font" w:hAnsi="NSW Foundation Font"/>
+                <w:rFonts w:ascii="Edu NSW ACT Foundation" w:cs="Edu NSW ACT Foundation" w:eastAsia="Edu NSW ACT Foundation" w:hAnsi="Edu NSW ACT Foundation"/>
                 <w:b w:val="1"/>
                 <w:bCs w:val="1"/>
               </w:rPr>
             </w:pPr>
             <w:r>
               <w:rPr>
-                <w:rFonts w:ascii="NSW Foundation Font" w:cs="NSW Foundation Font" w:eastAsia="NSW Foundation Font" w:hAnsi="NSW Foundation Font"/>
+                <w:rFonts w:ascii="Edu NSW ACT Foundation" w:cs="Edu NSW ACT Foundation" w:eastAsia="Edu NSW ACT Foundation" w:hAnsi="Edu NSW ACT Foundation"/>
                 <w:b w:val="1"/>
                 <w:bCs w:val="1"/>
                 <w:rtl w:val="0"/>
@@ -173,12 +173,12 @@
               <w:spacing w:line="240" w:lineRule="auto"/>
               <w:jc w:val="center"/>
               <w:rPr>
-                <w:rFonts w:ascii="NSW Foundation Font" w:cs="NSW Foundation Font" w:eastAsia="NSW Foundation Font" w:hAnsi="NSW Foundation Font"/>
+                <w:rFonts w:ascii="Edu NSW ACT Foundation" w:cs="Edu NSW ACT Foundation" w:eastAsia="Edu NSW ACT Foundation" w:hAnsi="Edu NSW ACT Foundation"/>
               </w:rPr>
             </w:pPr>
             <w:r>
               <w:rPr>
-                <w:rFonts w:ascii="NSW Foundation Font" w:cs="NSW Foundation Font" w:eastAsia="NSW Foundation Font" w:hAnsi="NSW Foundation Font"/>
+                <w:rFonts w:ascii="Edu NSW ACT Foundation" w:cs="Edu NSW ACT Foundation" w:eastAsia="Edu NSW ACT Foundation" w:hAnsi="Edu NSW ACT Foundation"/>
                 <w:rtl w:val="0"/>
               </w:rPr>
               <w:t xml:space="preserve">Red</w:t>
@@ -195,12 +195,12 @@
               <w:spacing w:line="240" w:lineRule="auto"/>
               <w:jc w:val="center"/>
               <w:rPr>
-                <w:rFonts w:ascii="NSW Foundation Font" w:cs="NSW Foundation Font" w:eastAsia="NSW Foundation Font" w:hAnsi="NSW Foundation Font"/>
+                <w:rFonts w:ascii="Edu NSW ACT Foundation" w:cs="Edu NSW ACT Foundation" w:eastAsia="Edu NSW ACT Foundation" w:hAnsi="Edu NSW ACT Foundation"/>
               </w:rPr>
             </w:pPr>
             <w:r>
               <w:rPr>
-                <w:rFonts w:ascii="NSW Foundation Font" w:cs="NSW Foundation Font" w:eastAsia="NSW Foundation Font" w:hAnsi="NSW Foundation Font"/>
+                <w:rFonts w:ascii="Edu NSW ACT Foundation" w:cs="Edu NSW ACT Foundation" w:eastAsia="Edu NSW ACT Foundation" w:hAnsi="Edu NSW ACT Foundation"/>
                 <w:rtl w:val="0"/>
               </w:rPr>
               <w:t xml:space="preserve">Yellow</w:t>
@@ -217,12 +217,12 @@
               <w:spacing w:line="240" w:lineRule="auto"/>
               <w:jc w:val="center"/>
               <w:rPr>
-                <w:rFonts w:ascii="NSW Foundation Font" w:cs="NSW Foundation Font" w:eastAsia="NSW Foundation Font" w:hAnsi="NSW Foundation Font"/>
+                <w:rFonts w:ascii="Edu NSW ACT Foundation" w:cs="Edu NSW ACT Foundation" w:eastAsia="Edu NSW ACT Foundation" w:hAnsi="Edu NSW ACT Foundation"/>
               </w:rPr>
             </w:pPr>
             <w:r>
               <w:rPr>
-                <w:rFonts w:ascii="NSW Foundation Font" w:cs="NSW Foundation Font" w:eastAsia="NSW Foundation Font" w:hAnsi="NSW Foundation Font"/>
+                <w:rFonts w:ascii="Edu NSW ACT Foundation" w:cs="Edu NSW ACT Foundation" w:eastAsia="Edu NSW ACT Foundation" w:hAnsi="Edu NSW ACT Foundation"/>
                 <w:rtl w:val="0"/>
               </w:rPr>
               <w:t xml:space="preserve">Green</w:t>
@@ -256,7 +256,7 @@
             </w:pPr>
             <w:r>
               <w:rPr>
-                <w:rFonts w:ascii="NSW Foundation Font" w:cs="NSW Foundation Font" w:eastAsia="NSW Foundation Font" w:hAnsi="NSW Foundation Font"/>
+                <w:rFonts w:ascii="Edu NSW ACT Foundation" w:cs="Edu NSW ACT Foundation" w:eastAsia="Edu NSW ACT Foundation" w:hAnsi="Edu NSW ACT Foundation"/>
                 <w:sz w:val="32"/>
                 <w:szCs w:val="32"/>
                 <w:rtl w:val="0"/>
@@ -283,7 +283,7 @@
             </w:pPr>
             <w:r>
               <w:rPr>
-                <w:rFonts w:ascii="NSW Foundation Font" w:cs="NSW Foundation Font" w:eastAsia="NSW Foundation Font" w:hAnsi="NSW Foundation Font"/>
+                <w:rFonts w:ascii="Edu NSW ACT Foundation" w:cs="Edu NSW ACT Foundation" w:eastAsia="Edu NSW ACT Foundation" w:hAnsi="Edu NSW ACT Foundation"/>
                 <w:sz w:val="32"/>
                 <w:szCs w:val="32"/>
                 <w:rtl w:val="0"/>
@@ -310,7 +310,7 @@
             </w:pPr>
             <w:r>
               <w:rPr>
-                <w:rFonts w:ascii="NSW Foundation Font" w:cs="NSW Foundation Font" w:eastAsia="NSW Foundation Font" w:hAnsi="NSW Foundation Font"/>
+                <w:rFonts w:ascii="Edu NSW ACT Foundation" w:cs="Edu NSW ACT Foundation" w:eastAsia="Edu NSW ACT Foundation" w:hAnsi="Edu NSW ACT Foundation"/>
                 <w:sz w:val="32"/>
                 <w:szCs w:val="32"/>
                 <w:rtl w:val="0"/>
@@ -340,7 +340,7 @@
             </w:pPr>
             <w:r>
               <w:rPr>
-                <w:rFonts w:ascii="NSW Foundation Font" w:cs="NSW Foundation Font" w:eastAsia="NSW Foundation Font" w:hAnsi="NSW Foundation Font"/>
+                <w:rFonts w:ascii="Edu NSW ACT Foundation" w:cs="Edu NSW ACT Foundation" w:eastAsia="Edu NSW ACT Foundation" w:hAnsi="Edu NSW ACT Foundation"/>
                 <w:sz w:val="32"/>
                 <w:szCs w:val="32"/>
                 <w:rtl w:val="0"/>
@@ -367,7 +367,7 @@
             </w:pPr>
             <w:r>
               <w:rPr>
-                <w:rFonts w:ascii="NSW Foundation Font" w:cs="NSW Foundation Font" w:eastAsia="NSW Foundation Font" w:hAnsi="NSW Foundation Font"/>
+                <w:rFonts w:ascii="Edu NSW ACT Foundation" w:cs="Edu NSW ACT Foundation" w:eastAsia="Edu NSW ACT Foundation" w:hAnsi="Edu NSW ACT Foundation"/>
                 <w:sz w:val="32"/>
                 <w:szCs w:val="32"/>
                 <w:rtl w:val="0"/>
@@ -394,7 +394,7 @@
             </w:pPr>
             <w:r>
               <w:rPr>
-                <w:rFonts w:ascii="NSW Foundation Font" w:cs="NSW Foundation Font" w:eastAsia="NSW Foundation Font" w:hAnsi="NSW Foundation Font"/>
+                <w:rFonts w:ascii="Edu NSW ACT Foundation" w:cs="Edu NSW ACT Foundation" w:eastAsia="Edu NSW ACT Foundation" w:hAnsi="Edu NSW ACT Foundation"/>
                 <w:sz w:val="32"/>
                 <w:szCs w:val="32"/>
                 <w:rtl w:val="0"/>
@@ -421,7 +421,7 @@
             </w:pPr>
             <w:r>
               <w:rPr>
-                <w:rFonts w:ascii="NSW Foundation Font" w:cs="NSW Foundation Font" w:eastAsia="NSW Foundation Font" w:hAnsi="NSW Foundation Font"/>
+                <w:rFonts w:ascii="Edu NSW ACT Foundation" w:cs="Edu NSW ACT Foundation" w:eastAsia="Edu NSW ACT Foundation" w:hAnsi="Edu NSW ACT Foundation"/>
                 <w:sz w:val="32"/>
                 <w:szCs w:val="32"/>
                 <w:rtl w:val="0"/>
@@ -451,7 +451,7 @@
             </w:pPr>
             <w:r>
               <w:rPr>
-                <w:rFonts w:ascii="NSW Foundation Font" w:cs="NSW Foundation Font" w:eastAsia="NSW Foundation Font" w:hAnsi="NSW Foundation Font"/>
+                <w:rFonts w:ascii="Edu NSW ACT Foundation" w:cs="Edu NSW ACT Foundation" w:eastAsia="Edu NSW ACT Foundation" w:hAnsi="Edu NSW ACT Foundation"/>
                 <w:sz w:val="32"/>
                 <w:szCs w:val="32"/>
                 <w:rtl w:val="0"/>
@@ -478,7 +478,7 @@
             </w:pPr>
             <w:r>
               <w:rPr>
-                <w:rFonts w:ascii="NSW Foundation Font" w:cs="NSW Foundation Font" w:eastAsia="NSW Foundation Font" w:hAnsi="NSW Foundation Font"/>
+                <w:rFonts w:ascii="Edu NSW ACT Foundation" w:cs="Edu NSW ACT Foundation" w:eastAsia="Edu NSW ACT Foundation" w:hAnsi="Edu NSW ACT Foundation"/>
                 <w:sz w:val="32"/>
                 <w:szCs w:val="32"/>
                 <w:rtl w:val="0"/>
@@ -505,7 +505,7 @@
             </w:pPr>
             <w:r>
               <w:rPr>
-                <w:rFonts w:ascii="NSW Foundation Font" w:cs="NSW Foundation Font" w:eastAsia="NSW Foundation Font" w:hAnsi="NSW Foundation Font"/>
+                <w:rFonts w:ascii="Edu NSW ACT Foundation" w:cs="Edu NSW ACT Foundation" w:eastAsia="Edu NSW ACT Foundation" w:hAnsi="Edu NSW ACT Foundation"/>
                 <w:sz w:val="32"/>
                 <w:szCs w:val="32"/>
                 <w:rtl w:val="0"/>

</xml_diff>

<commit_message>
fix(solo): put rubric title in its own table row, not a floating-anchor paragraph
The title was living in the paragraph the table floats relative to
(tblpPr vertAnchor="text"), which turned out to render inconsistently —
the title ended up drawn after the table instead of before it.

Title is now a real first row of the table itself (cloned from the existing
full-width "LEARNING INTENTION" banner row), so its position is fixed by
ordinary row order and can't be affected by floating/anchor behaviour.
The pre-table paragraph is back to empty, matching the original file.

Co-Authored-By: Claude Sonnet 5 <noreply@anthropic.com>
</commit_message>
<xml_diff>
--- a/units/u21/Unit 21 Place Value, Decimals & Powers of 10 Student Rubric.docx
+++ b/units/u21/Unit 21 Place Value, Decimals & Powers of 10 Student Rubric.docx
@@ -2,22 +2,40 @@
 <file path=word/document.xml><?xml version="1.0" encoding="utf-8"?>
 <w:document xmlns:ns1="http://schemas.microsoft.com/office/word/2010/wordml" xmlns:w="http://schemas.openxmlformats.org/wordprocessingml/2006/main">
   <w:body>
-    <w:p ns1:paraId="00000001">
-      <w:pPr>
-        <w:spacing w:before="0" w:after="0" w:line="240" w:lineRule="auto"/>
-        <w:jc w:val="center"/>
-      </w:pPr>
-      <w:r>
-        <w:rPr>
-          <w:rFonts w:ascii="Edu NSW ACT Foundation" w:hAnsi="Edu NSW ACT Foundation" w:cs="Edu NSW ACT Foundation" w:eastAsia="Edu NSW ACT Foundation"/>
-          <w:b/>
-          <w:sz w:val="36"/>
-          <w:szCs w:val="36"/>
-        </w:rPr>
-        <w:t xml:space="preserve">Unit 21 — Place Value, Decimals &amp; Powers of 10</w:t>
-      </w:r>
-    </w:p>
+    <w:p ns1:paraId="00000001"/>
     <w:tbl>
+      <w:tr>
+        <w:trPr>
+          <w:cantSplit w:val="0"/>
+          <w:trHeight w:val="375" w:hRule="atLeast"/>
+          <w:tblHeader w:val="0"/>
+        </w:trPr>
+        <w:tc>
+          <w:tcPr>
+            <w:gridSpan w:val="3"/>
+            <w:shd w:fill="9fc5e8" w:val="clear"/>
+          </w:tcPr>
+          <w:p ns1:paraId="00000002">
+            <w:pPr>
+              <w:widowControl w:val="0"/>
+              <w:spacing w:line="240" w:lineRule="auto"/>
+              <w:jc w:val="center"/>
+              <w:rPr>
+                <w:rFonts w:ascii="Edu NSW ACT Foundation" w:cs="Edu NSW ACT Foundation" w:eastAsia="Edu NSW ACT Foundation" w:hAnsi="Edu NSW ACT Foundation"/>
+              </w:rPr>
+            </w:pPr>
+            <w:r>
+              <w:rPr>
+                <w:rFonts w:ascii="Edu NSW ACT Foundation" w:hAnsi="Edu NSW ACT Foundation" w:cs="Edu NSW ACT Foundation" w:eastAsia="Edu NSW ACT Foundation"/>
+                <w:b/>
+                <w:sz w:val="36"/>
+                <w:szCs w:val="36"/>
+              </w:rPr>
+              <w:t xml:space="preserve">Unit 21 — Place Value, Decimals &amp; Powers of 10</w:t>
+            </w:r>
+          </w:p>
+        </w:tc>
+      </w:tr>
       <w:tblPr>
         <w:tblStyle w:val="Table1"/>
         <w:tblpPr w:leftFromText="180" w:rightFromText="180" w:topFromText="180" w:bottomFromText="180" w:vertAnchor="text" w:horzAnchor="text" w:tblpX="-180" w:tblpY="0"/>

</xml_diff>